<commit_message>
Update COMP4145 Lab2 report document
</commit_message>
<xml_diff>
--- a/COMP4145-VibeCoding_Lab2.docx
+++ b/COMP4145-VibeCoding_Lab2.docx
@@ -1,6 +1,6 @@
 
 <file path=word/document.xml><?xml version="1.0" encoding="utf-8"?>
-<w:document xmlns:wpc="http://schemas.microsoft.com/office/word/2010/wordprocessingCanvas" xmlns:cx="http://schemas.microsoft.com/office/drawing/2014/chartex" xmlns:cx1="http://schemas.microsoft.com/office/drawing/2015/9/8/chartex" xmlns:cx2="http://schemas.microsoft.com/office/drawing/2015/10/21/chartex" xmlns:cx3="http://schemas.microsoft.com/office/drawing/2016/5/9/chartex" xmlns:cx4="http://schemas.microsoft.com/office/drawing/2016/5/10/chartex" xmlns:cx5="http://schemas.microsoft.com/office/drawing/2016/5/11/chartex" xmlns:cx6="http://schemas.microsoft.com/office/drawing/2016/5/12/chartex" xmlns:cx7="http://schemas.microsoft.com/office/drawing/2016/5/13/chartex" xmlns:cx8="http://schemas.microsoft.com/office/drawing/2016/5/14/chartex" xmlns:mc="http://schemas.openxmlformats.org/markup-compatibility/2006" xmlns:aink="http://schemas.microsoft.com/office/drawing/2016/ink" xmlns:am3d="http://schemas.microsoft.com/office/drawing/2017/model3d" xmlns:o="urn:schemas-microsoft-com:office:office" xmlns:oel="http://schemas.microsoft.com/office/2019/extlst" xmlns:r="http://schemas.openxmlformats.org/officeDocument/2006/relationships" xmlns:m="http://schemas.openxmlformats.org/officeDocument/2006/math" xmlns:v="urn:schemas-microsoft-com:vml" xmlns:wp14="http://schemas.microsoft.com/office/word/2010/wordprocessingDrawing" xmlns:wp="http://schemas.openxmlformats.org/drawingml/2006/wordprocessingDrawing" xmlns:w10="urn:schemas-microsoft-com:office:word" xmlns:w="http://schemas.openxmlformats.org/wordprocessingml/2006/main" xmlns:w14="http://schemas.microsoft.com/office/word/2010/wordml" xmlns:w15="http://schemas.microsoft.com/office/word/2012/wordml" xmlns:w16cex="http://schemas.microsoft.com/office/word/2018/wordml/cex" xmlns:w16cid="http://schemas.microsoft.com/office/word/2016/wordml/cid" xmlns:w16="http://schemas.microsoft.com/office/word/2018/wordml" xmlns:w16du="http://schemas.microsoft.com/office/word/2023/wordml/word16du" xmlns:w16sdtdh="http://schemas.microsoft.com/office/word/2020/wordml/sdtdatahash" xmlns:w16sdtfl="http://schemas.microsoft.com/office/word/2024/wordml/sdtformatlock" xmlns:w16se="http://schemas.microsoft.com/office/word/2015/wordml/symex" xmlns:wpg="http://schemas.microsoft.com/office/word/2010/wordprocessingGroup" xmlns:wpi="http://schemas.microsoft.com/office/word/2010/wordprocessingInk" xmlns:wne="http://schemas.microsoft.com/office/word/2006/wordml" xmlns:wps="http://schemas.microsoft.com/office/word/2010/wordprocessingShape" mc:Ignorable="w14 w15 w16se w16cid w16 w16cex w16sdtdh w16sdtfl w16du wp14">
+<w:document xmlns:wpc="http://schemas.microsoft.com/office/word/2010/wordprocessingCanvas" xmlns:cx="http://schemas.microsoft.com/office/drawing/2014/chartex" xmlns:cx1="http://schemas.microsoft.com/office/drawing/2015/9/8/chartex" xmlns:cx2="http://schemas.microsoft.com/office/drawing/2015/10/21/chartex" xmlns:cx3="http://schemas.microsoft.com/office/drawing/2016/5/9/chartex" xmlns:cx4="http://schemas.microsoft.com/office/drawing/2016/5/10/chartex" xmlns:cx5="http://schemas.microsoft.com/office/drawing/2016/5/11/chartex" xmlns:cx6="http://schemas.microsoft.com/office/drawing/2016/5/12/chartex" xmlns:cx7="http://schemas.microsoft.com/office/drawing/2016/5/13/chartex" xmlns:cx8="http://schemas.microsoft.com/office/drawing/2016/5/14/chartex" xmlns:mc="http://schemas.openxmlformats.org/markup-compatibility/2006" xmlns:m="http://schemas.openxmlformats.org/officeDocument/2006/math" xmlns:aink="http://schemas.microsoft.com/office/drawing/2016/ink" xmlns:am3d="http://schemas.microsoft.com/office/drawing/2017/model3d" xmlns:oel="http://schemas.microsoft.com/office/2019/extlst" xmlns:r="http://schemas.openxmlformats.org/officeDocument/2006/relationships" xmlns:wp14="http://schemas.microsoft.com/office/word/2010/wordprocessingDrawing" xmlns:wp="http://schemas.openxmlformats.org/drawingml/2006/wordprocessingDrawing" xmlns:wpg="http://schemas.microsoft.com/office/word/2010/wordprocessingGroup" xmlns:wpi="http://schemas.microsoft.com/office/word/2010/wordprocessingInk" xmlns:wps="http://schemas.microsoft.com/office/word/2010/wordprocessingShape" xmlns:o="urn:schemas-microsoft-com:office:office" xmlns:v="urn:schemas-microsoft-com:vml" xmlns:w10="urn:schemas-microsoft-com:office:word" xmlns:w="http://schemas.openxmlformats.org/wordprocessingml/2006/main" xmlns:w14="http://schemas.microsoft.com/office/word/2010/wordml" xmlns:w15="http://schemas.microsoft.com/office/word/2012/wordml" xmlns:w16cei="http://schemas.microsoft.com/office/word/2026/wordml/cei" xmlns:w16cex="http://schemas.microsoft.com/office/word/2018/wordml/cex" xmlns:w16cid="http://schemas.microsoft.com/office/word/2016/wordml/cid" xmlns:w16="http://schemas.microsoft.com/office/word/2018/wordml" xmlns:w16sdtdh="http://schemas.microsoft.com/office/word/2020/wordml/sdtdatahash" xmlns:w16sdtfl="http://schemas.microsoft.com/office/word/2024/wordml/sdtformatlock" xmlns:w16se="http://schemas.microsoft.com/office/word/2015/wordml/symex" xmlns:w16du="http://schemas.microsoft.com/office/word/2023/wordml/word16du" xmlns:wne="http://schemas.microsoft.com/office/word/2006/wordml" mc:Ignorable="w14 w15 w16se w16cid w16 w16cex w16sdtdh w16sdtfl w16du wp14">
   <w:body>
     <w:p>
       <w:pPr>
@@ -550,25 +550,7 @@
           <w:bCs/>
           <w:lang w:val="en-HK"/>
         </w:rPr>
-        <w:t xml:space="preserve">Developers can work on their files </w:t>
-      </w:r>
-      <w:proofErr w:type="gramStart"/>
-      <w:r>
-        <w:rPr>
-          <w:rFonts w:ascii="Cambria" w:eastAsiaTheme="minorEastAsia" w:hAnsi="Cambria" w:cstheme="minorHAnsi"/>
-          <w:bCs/>
-          <w:lang w:val="en-HK"/>
-        </w:rPr>
-        <w:t>locally, and</w:t>
-      </w:r>
-      <w:proofErr w:type="gramEnd"/>
-      <w:r>
-        <w:rPr>
-          <w:rFonts w:ascii="Cambria" w:eastAsiaTheme="minorEastAsia" w:hAnsi="Cambria" w:cstheme="minorHAnsi"/>
-          <w:bCs/>
-          <w:lang w:val="en-HK"/>
-        </w:rPr>
-        <w:t xml:space="preserve"> continually </w:t>
+        <w:t xml:space="preserve">Developers can work on their files locally, and continually </w:t>
       </w:r>
       <w:r>
         <w:rPr>
@@ -1700,7 +1682,6 @@
               </w:rPr>
               <w:t xml:space="preserve"> </w:t>
             </w:r>
-            <w:proofErr w:type="gramStart"/>
             <w:r>
               <w:rPr>
                 <w:rFonts w:ascii="Cambria" w:hAnsi="Cambria"/>
@@ -1728,15 +1709,7 @@
                 <w:rFonts w:ascii="Cambria" w:hAnsi="Cambria"/>
                 <w:lang w:val="en-HK"/>
               </w:rPr>
-              <w:t>, and</w:t>
-            </w:r>
-            <w:proofErr w:type="gramEnd"/>
-            <w:r>
-              <w:rPr>
-                <w:rFonts w:ascii="Cambria" w:hAnsi="Cambria"/>
-                <w:lang w:val="en-HK"/>
-              </w:rPr>
-              <w:t xml:space="preserve"> choose </w:t>
+              <w:t xml:space="preserve">, and choose </w:t>
             </w:r>
             <w:r>
               <w:rPr>
@@ -3043,7 +3016,21 @@
                   <w:rStyle w:val="Hyperlink"/>
                   <w:rFonts w:ascii="Cambria" w:eastAsia="Segoe UI" w:hAnsi="Cambria"/>
                 </w:rPr>
-                <w:t>https://colab.research.google.com/drive/1G_vS2pADjCSbezG0tFyIhr-8ksWnx-Wh?usp=sharing</w:t>
+                <w:t>https://colab.research.google.com/drive/1G_vS2pADjCSbezG0tF</w:t>
+              </w:r>
+              <w:r>
+                <w:rPr>
+                  <w:rStyle w:val="Hyperlink"/>
+                  <w:rFonts w:ascii="Cambria" w:eastAsia="Segoe UI" w:hAnsi="Cambria"/>
+                </w:rPr>
+                <w:t>y</w:t>
+              </w:r>
+              <w:r>
+                <w:rPr>
+                  <w:rStyle w:val="Hyperlink"/>
+                  <w:rFonts w:ascii="Cambria" w:eastAsia="Segoe UI" w:hAnsi="Cambria"/>
+                </w:rPr>
+                <w:t>Ihr-8ksWnx-Wh?usp=sharing</w:t>
               </w:r>
             </w:hyperlink>
           </w:p>
@@ -3652,7 +3639,7 @@
                 <w:noProof/>
               </w:rPr>
               <w:drawing>
-                <wp:inline distT="0" distB="0" distL="0" distR="0" wp14:anchorId="36A393E9" wp14:editId="0B9AE637">
+                <wp:inline distT="0" distB="0" distL="0" distR="0" wp14:anchorId="36A393E9" wp14:editId="6D9A37EA">
                   <wp:extent cx="3060700" cy="1185545"/>
                   <wp:effectExtent l="0" t="0" r="0" b="0"/>
                   <wp:docPr id="71" name="圖片 71" descr="一張含有 文字, 螢幕擷取畫面, 字型 的圖片&#10;&#10;自動產生的描述"/>
@@ -4344,16 +4331,8 @@
               <w:rPr>
                 <w:rFonts w:ascii="Cambria" w:hAnsi="Cambria"/>
               </w:rPr>
-              <w:t xml:space="preserve">ask </w:t>
-            </w:r>
-            <w:proofErr w:type="gramStart"/>
-            <w:r>
-              <w:rPr>
-                <w:rFonts w:ascii="Cambria" w:hAnsi="Cambria"/>
-              </w:rPr>
-              <w:t>question</w:t>
-            </w:r>
-            <w:proofErr w:type="gramEnd"/>
+              <w:t>ask question</w:t>
+            </w:r>
             <w:r>
               <w:rPr>
                 <w:rFonts w:ascii="Cambria" w:hAnsi="Cambria"/>
@@ -4503,23 +4482,7 @@
                 <w:rFonts w:ascii="Cambria" w:eastAsiaTheme="minorEastAsia" w:hAnsi="Cambria"/>
                 <w:lang w:val="en-HK"/>
               </w:rPr>
-              <w:t xml:space="preserve">“What </w:t>
-            </w:r>
-            <w:proofErr w:type="gramStart"/>
-            <w:r>
-              <w:rPr>
-                <w:rFonts w:ascii="Cambria" w:eastAsiaTheme="minorEastAsia" w:hAnsi="Cambria"/>
-                <w:lang w:val="en-HK"/>
-              </w:rPr>
-              <w:t>is</w:t>
-            </w:r>
-            <w:proofErr w:type="gramEnd"/>
-            <w:r>
-              <w:rPr>
-                <w:rFonts w:ascii="Cambria" w:eastAsiaTheme="minorEastAsia" w:hAnsi="Cambria"/>
-                <w:lang w:val="en-HK"/>
-              </w:rPr>
-              <w:t xml:space="preserve"> the criteria for buy signal?”</w:t>
+              <w:t>“What is the criteria for buy signal?”</w:t>
             </w:r>
           </w:p>
           <w:p>
@@ -4548,23 +4511,7 @@
                 <w:rFonts w:ascii="Cambria" w:eastAsiaTheme="minorEastAsia" w:hAnsi="Cambria"/>
                 <w:lang w:val="en-HK"/>
               </w:rPr>
-              <w:t xml:space="preserve">“What </w:t>
-            </w:r>
-            <w:proofErr w:type="gramStart"/>
-            <w:r>
-              <w:rPr>
-                <w:rFonts w:ascii="Cambria" w:eastAsiaTheme="minorEastAsia" w:hAnsi="Cambria"/>
-                <w:lang w:val="en-HK"/>
-              </w:rPr>
-              <w:t>is</w:t>
-            </w:r>
-            <w:proofErr w:type="gramEnd"/>
-            <w:r>
-              <w:rPr>
-                <w:rFonts w:ascii="Cambria" w:eastAsiaTheme="minorEastAsia" w:hAnsi="Cambria"/>
-                <w:lang w:val="en-HK"/>
-              </w:rPr>
-              <w:t xml:space="preserve"> the criteria for sell signal?”</w:t>
+              <w:t>“What is the criteria for sell signal?”</w:t>
             </w:r>
           </w:p>
           <w:p>
@@ -5471,7 +5418,7 @@
                 <w:lang w:val="en-HK"/>
               </w:rPr>
               <w:drawing>
-                <wp:inline distT="0" distB="0" distL="0" distR="0" wp14:anchorId="090673DB" wp14:editId="79D215CA">
+                <wp:inline distT="0" distB="0" distL="0" distR="0" wp14:anchorId="090673DB" wp14:editId="50ABE5C3">
                   <wp:extent cx="3060065" cy="1791335"/>
                   <wp:effectExtent l="0" t="0" r="635" b="0"/>
                   <wp:docPr id="83" name="圖片 83" descr="一張含有 文字, 螢幕擷取畫面, 字型 的圖片&#10;&#10;自動產生的描述"/>
@@ -6506,21 +6453,7 @@
               <w:rPr>
                 <w:rFonts w:ascii="Cambria" w:hAnsi="Cambria"/>
               </w:rPr>
-              <w:t xml:space="preserve">Launch the </w:t>
-            </w:r>
-            <w:proofErr w:type="gramStart"/>
-            <w:r>
-              <w:rPr>
-                <w:rFonts w:ascii="Cambria" w:hAnsi="Cambria"/>
-              </w:rPr>
-              <w:t>frontend</w:t>
-            </w:r>
-            <w:proofErr w:type="gramEnd"/>
-            <w:r>
-              <w:rPr>
-                <w:rFonts w:ascii="Cambria" w:hAnsi="Cambria"/>
-              </w:rPr>
-              <w:t xml:space="preserve">: </w:t>
+              <w:t xml:space="preserve">Launch the frontend: </w:t>
             </w:r>
           </w:p>
           <w:p>
@@ -7138,7 +7071,7 @@
                 <w:noProof/>
               </w:rPr>
               <w:drawing>
-                <wp:inline distT="0" distB="0" distL="0" distR="0" wp14:anchorId="4B3ECB73" wp14:editId="0E01E59B">
+                <wp:inline distT="0" distB="0" distL="0" distR="0" wp14:anchorId="4B3ECB73" wp14:editId="050FF80E">
                   <wp:extent cx="3060065" cy="785495"/>
                   <wp:effectExtent l="0" t="0" r="635" b="1905"/>
                   <wp:docPr id="107" name="圖片 107" descr="一張含有 文字, 字型, 螢幕擷取畫面 的圖片&#10;&#10;自動產生的描述"/>
@@ -7353,7 +7286,21 @@
                   <w:rStyle w:val="Hyperlink"/>
                   <w:rFonts w:ascii="Cambria" w:hAnsi="Cambria"/>
                 </w:rPr>
-                <w:t>https://github.com</w:t>
+                <w:t>https://githu</w:t>
+              </w:r>
+              <w:r>
+                <w:rPr>
+                  <w:rStyle w:val="Hyperlink"/>
+                  <w:rFonts w:ascii="Cambria" w:hAnsi="Cambria"/>
+                </w:rPr>
+                <w:t>b</w:t>
+              </w:r>
+              <w:r>
+                <w:rPr>
+                  <w:rStyle w:val="Hyperlink"/>
+                  <w:rFonts w:ascii="Cambria" w:hAnsi="Cambria"/>
+                </w:rPr>
+                <w:t>.com</w:t>
               </w:r>
             </w:hyperlink>
             <w:r>
@@ -7439,7 +7386,6 @@
               </w:rPr>
               <w:t xml:space="preserve"> </w:t>
             </w:r>
-            <w:proofErr w:type="gramStart"/>
             <w:r>
               <w:rPr>
                 <w:rFonts w:ascii="Cambria" w:hAnsi="Cambria" w:hint="eastAsia"/>
@@ -7447,17 +7393,7 @@
                 <w:bCs/>
                 <w:lang w:val="en-HK"/>
               </w:rPr>
-              <w:t>New</w:t>
-            </w:r>
-            <w:proofErr w:type="gramEnd"/>
-            <w:r>
-              <w:rPr>
-                <w:rFonts w:ascii="Cambria" w:hAnsi="Cambria" w:hint="eastAsia"/>
-                <w:b/>
-                <w:bCs/>
-                <w:lang w:val="en-HK"/>
-              </w:rPr>
-              <w:t xml:space="preserve"> repository</w:t>
+              <w:t>New repository</w:t>
             </w:r>
             <w:r>
               <w:rPr>
@@ -9027,7 +8963,7 @@
                 <w:noProof/>
               </w:rPr>
               <w:drawing>
-                <wp:inline distT="0" distB="0" distL="0" distR="0" wp14:anchorId="68695B0C" wp14:editId="4909C4F1">
+                <wp:inline distT="0" distB="0" distL="0" distR="0" wp14:anchorId="68695B0C" wp14:editId="35B53DC8">
                   <wp:extent cx="289560" cy="229235"/>
                   <wp:effectExtent l="0" t="0" r="2540" b="0"/>
                   <wp:docPr id="203" name="圖片 203" descr="一張含有 黑色, 螢幕擷取畫面, 圓形, 剪刀 的圖片&#10;&#10;自動產生的描述"/>
@@ -9871,7 +9807,23 @@
                   <w:rFonts w:ascii="Cambria" w:hAnsi="Cambria"/>
                   <w:bCs/>
                 </w:rPr>
-                <w:t>https://share.streamlit.io/</w:t>
+                <w:t>https://share.</w:t>
+              </w:r>
+              <w:r>
+                <w:rPr>
+                  <w:rStyle w:val="Hyperlink"/>
+                  <w:rFonts w:ascii="Cambria" w:hAnsi="Cambria"/>
+                  <w:bCs/>
+                </w:rPr>
+                <w:t>s</w:t>
+              </w:r>
+              <w:r>
+                <w:rPr>
+                  <w:rStyle w:val="Hyperlink"/>
+                  <w:rFonts w:ascii="Cambria" w:hAnsi="Cambria"/>
+                  <w:bCs/>
+                </w:rPr>
+                <w:t>treamlit.io/</w:t>
               </w:r>
             </w:hyperlink>
           </w:p>
@@ -9917,32 +9869,14 @@
                 <w:bCs/>
                 <w:lang w:val="en-HK"/>
               </w:rPr>
-              <w:t>Continue to sign-</w:t>
-            </w:r>
-            <w:proofErr w:type="gramStart"/>
-            <w:r>
-              <w:rPr>
-                <w:rFonts w:ascii="Cambria" w:hAnsi="Cambria"/>
-                <w:b/>
-                <w:bCs/>
+              <w:t>Continue to sign-in</w:t>
+            </w:r>
+            <w:r>
+              <w:rPr>
+                <w:rFonts w:ascii="Cambria" w:hAnsi="Cambria"/>
                 <w:lang w:val="en-HK"/>
               </w:rPr>
-              <w:t>in</w:t>
-            </w:r>
-            <w:r>
-              <w:rPr>
-                <w:rFonts w:ascii="Cambria" w:hAnsi="Cambria"/>
-                <w:lang w:val="en-HK"/>
-              </w:rPr>
-              <w:t>, and</w:t>
-            </w:r>
-            <w:proofErr w:type="gramEnd"/>
-            <w:r>
-              <w:rPr>
-                <w:rFonts w:ascii="Cambria" w:hAnsi="Cambria"/>
-                <w:lang w:val="en-HK"/>
-              </w:rPr>
-              <w:t xml:space="preserve"> then </w:t>
+              <w:t xml:space="preserve">, and then </w:t>
             </w:r>
             <w:r>
               <w:rPr>
@@ -10387,7 +10321,6 @@
               <w:t xml:space="preserve">uthorize </w:t>
             </w:r>
             <w:proofErr w:type="spellStart"/>
-            <w:proofErr w:type="gramStart"/>
             <w:r>
               <w:rPr>
                 <w:rFonts w:ascii="Cambria" w:hAnsi="Cambria"/>
@@ -10402,14 +10335,7 @@
               <w:rPr>
                 <w:rFonts w:ascii="Cambria" w:hAnsi="Cambria"/>
               </w:rPr>
-              <w:t>, and</w:t>
-            </w:r>
-            <w:proofErr w:type="gramEnd"/>
-            <w:r>
-              <w:rPr>
-                <w:rFonts w:ascii="Cambria" w:hAnsi="Cambria"/>
-              </w:rPr>
-              <w:t xml:space="preserve"> then verify to confirm access. </w:t>
+              <w:t xml:space="preserve">, and then verify to confirm access. </w:t>
             </w:r>
           </w:p>
         </w:tc>
@@ -10881,21 +10807,7 @@
               <w:rPr>
                 <w:rFonts w:ascii="Cambria" w:hAnsi="Cambria"/>
               </w:rPr>
-              <w:t xml:space="preserve"> launch the </w:t>
-            </w:r>
-            <w:proofErr w:type="gramStart"/>
-            <w:r>
-              <w:rPr>
-                <w:rFonts w:ascii="Cambria" w:hAnsi="Cambria"/>
-              </w:rPr>
-              <w:t>frontend</w:t>
-            </w:r>
-            <w:proofErr w:type="gramEnd"/>
-            <w:r>
-              <w:rPr>
-                <w:rFonts w:ascii="Cambria" w:hAnsi="Cambria"/>
-              </w:rPr>
-              <w:t xml:space="preserve">: </w:t>
+              <w:t xml:space="preserve"> launch the frontend: </w:t>
             </w:r>
           </w:p>
           <w:p>
@@ -11782,35 +11694,7 @@
               <w:rPr>
                 <w:rFonts w:ascii="Cambria" w:hAnsi="Cambria"/>
               </w:rPr>
-              <w:t xml:space="preserve">hen, it will give you </w:t>
-            </w:r>
-            <w:proofErr w:type="gramStart"/>
-            <w:r>
-              <w:rPr>
-                <w:rFonts w:ascii="Cambria" w:hAnsi="Cambria"/>
-              </w:rPr>
-              <w:t>the</w:t>
-            </w:r>
-            <w:proofErr w:type="gramEnd"/>
-            <w:r>
-              <w:rPr>
-                <w:rFonts w:ascii="Cambria" w:hAnsi="Cambria"/>
-              </w:rPr>
-              <w:t xml:space="preserve"> reason and solution. Ask copilot to </w:t>
-            </w:r>
-            <w:proofErr w:type="gramStart"/>
-            <w:r>
-              <w:rPr>
-                <w:rFonts w:ascii="Cambria" w:hAnsi="Cambria"/>
-              </w:rPr>
-              <w:t>help</w:t>
-            </w:r>
-            <w:proofErr w:type="gramEnd"/>
-            <w:r>
-              <w:rPr>
-                <w:rFonts w:ascii="Cambria" w:hAnsi="Cambria"/>
-              </w:rPr>
-              <w:t xml:space="preserve"> </w:t>
+              <w:t xml:space="preserve">hen, it will give you the reason and solution. Ask copilot to help </w:t>
             </w:r>
             <w:r>
               <w:rPr>
@@ -12298,14 +12182,7 @@
               <w:rPr>
                 <w:rFonts w:ascii="Cambria" w:hAnsi="Cambria"/>
               </w:rPr>
-              <w:t xml:space="preserve"> </w:t>
-            </w:r>
-            <w:proofErr w:type="gramStart"/>
-            <w:r>
-              <w:rPr>
-                <w:rFonts w:ascii="Cambria" w:hAnsi="Cambria"/>
-              </w:rPr>
-              <w:t xml:space="preserve">the </w:t>
+              <w:t xml:space="preserve"> the </w:t>
             </w:r>
             <w:proofErr w:type="spellStart"/>
             <w:r>
@@ -12315,26 +12192,11 @@
               <w:t>Streamlit</w:t>
             </w:r>
             <w:proofErr w:type="spellEnd"/>
-            <w:proofErr w:type="gramEnd"/>
-            <w:r>
-              <w:rPr>
-                <w:rFonts w:ascii="Cambria" w:hAnsi="Cambria"/>
-              </w:rPr>
-              <w:t xml:space="preserve"> Cloud. You can share it </w:t>
-            </w:r>
-            <w:proofErr w:type="gramStart"/>
-            <w:r>
-              <w:rPr>
-                <w:rFonts w:ascii="Cambria" w:hAnsi="Cambria"/>
-              </w:rPr>
-              <w:t>to</w:t>
-            </w:r>
-            <w:proofErr w:type="gramEnd"/>
-            <w:r>
-              <w:rPr>
-                <w:rFonts w:ascii="Cambria" w:hAnsi="Cambria"/>
-              </w:rPr>
-              <w:t xml:space="preserve"> others </w:t>
+            <w:r>
+              <w:rPr>
+                <w:rFonts w:ascii="Cambria" w:hAnsi="Cambria"/>
+              </w:rPr>
+              <w:t xml:space="preserve"> Cloud. You can share it to others </w:t>
             </w:r>
           </w:p>
           <w:p>
@@ -12721,21 +12583,7 @@
               <w:rPr>
                 <w:rFonts w:ascii="Cambria" w:eastAsiaTheme="minorEastAsia" w:hAnsi="Cambria"/>
               </w:rPr>
-              <w:t xml:space="preserve"> and you may </w:t>
-            </w:r>
-            <w:proofErr w:type="gramStart"/>
-            <w:r>
-              <w:rPr>
-                <w:rFonts w:ascii="Cambria" w:eastAsiaTheme="minorEastAsia" w:hAnsi="Cambria"/>
-              </w:rPr>
-              <w:t>find</w:t>
-            </w:r>
-            <w:proofErr w:type="gramEnd"/>
-            <w:r>
-              <w:rPr>
-                <w:rFonts w:ascii="Cambria" w:eastAsiaTheme="minorEastAsia" w:hAnsi="Cambria"/>
-              </w:rPr>
-              <w:t xml:space="preserve"> from the below link:</w:t>
+              <w:t xml:space="preserve"> and you may find from the below link:</w:t>
             </w:r>
           </w:p>
           <w:p>
@@ -12892,7 +12740,20 @@
         <w:rPr>
           <w:rFonts w:ascii="Cambria" w:hAnsi="Cambria"/>
         </w:rPr>
-        <w:t xml:space="preserve">working on a new tool for a fintech startup aiming to help non-professional investors manage stock trading strategies. </w:t>
+        <w:t xml:space="preserve">working on a new tool for a fintech startup aiming to </w:t>
+      </w:r>
+      <w:r>
+        <w:rPr>
+          <w:rFonts w:ascii="Cambria" w:hAnsi="Cambria"/>
+          <w:highlight w:val="yellow"/>
+        </w:rPr>
+        <w:t>help non-professional investors manage stock trading strategies</w:t>
+      </w:r>
+      <w:r>
+        <w:rPr>
+          <w:rFonts w:ascii="Cambria" w:hAnsi="Cambria"/>
+        </w:rPr>
+        <w:t xml:space="preserve">. </w:t>
       </w:r>
     </w:p>
     <w:p>
@@ -13013,20 +12874,29 @@
       <w:r>
         <w:rPr>
           <w:rFonts w:ascii="Cambria" w:eastAsiaTheme="minorEastAsia" w:hAnsi="Cambria" w:hint="eastAsia"/>
+          <w:highlight w:val="yellow"/>
         </w:rPr>
         <w:t>three</w:t>
       </w:r>
       <w:r>
         <w:rPr>
           <w:rFonts w:ascii="Cambria" w:eastAsiaTheme="minorEastAsia" w:hAnsi="Cambria" w:hint="eastAsia"/>
+          <w:highlight w:val="yellow"/>
         </w:rPr>
         <w:t xml:space="preserve"> </w:t>
       </w:r>
       <w:r>
         <w:rPr>
           <w:rFonts w:ascii="Cambria" w:hAnsi="Cambria"/>
-        </w:rPr>
-        <w:t xml:space="preserve">additional features. </w:t>
+          <w:highlight w:val="yellow"/>
+        </w:rPr>
+        <w:t>additional features</w:t>
+      </w:r>
+      <w:r>
+        <w:rPr>
+          <w:rFonts w:ascii="Cambria" w:hAnsi="Cambria"/>
+        </w:rPr>
+        <w:t xml:space="preserve">. </w:t>
       </w:r>
       <w:r>
         <w:rPr>
@@ -14346,27 +14216,7 @@
           <w:iCs/>
           <w:lang w:val="en-HK"/>
         </w:rPr>
-        <w:t xml:space="preserve">UI: A simple interface with an image upload button and a </w:t>
-      </w:r>
-      <w:proofErr w:type="gramStart"/>
-      <w:r>
-        <w:rPr>
-          <w:rFonts w:ascii="Cambria" w:eastAsiaTheme="minorEastAsia" w:hAnsi="Cambria"/>
-          <w:i/>
-          <w:iCs/>
-          <w:lang w:val="en-HK"/>
-        </w:rPr>
-        <w:t>submit</w:t>
-      </w:r>
-      <w:proofErr w:type="gramEnd"/>
-      <w:r>
-        <w:rPr>
-          <w:rFonts w:ascii="Cambria" w:eastAsiaTheme="minorEastAsia" w:hAnsi="Cambria"/>
-          <w:i/>
-          <w:iCs/>
-          <w:lang w:val="en-HK"/>
-        </w:rPr>
-        <w:t xml:space="preserve"> button.</w:t>
+        <w:t>UI: A simple interface with an image upload button and a submit button.</w:t>
       </w:r>
     </w:p>
     <w:p>
@@ -15083,19 +14933,11 @@
         </w:rPr>
         <w:t xml:space="preserve"> </w:t>
       </w:r>
-      <w:proofErr w:type="gramStart"/>
       <w:r>
         <w:rPr>
           <w:rFonts w:ascii="Cambria" w:eastAsiaTheme="minorEastAsia" w:hAnsi="Cambria" w:hint="eastAsia"/>
         </w:rPr>
-        <w:t>demonstrate</w:t>
-      </w:r>
-      <w:proofErr w:type="gramEnd"/>
-      <w:r>
-        <w:rPr>
-          <w:rFonts w:ascii="Cambria" w:eastAsiaTheme="minorEastAsia" w:hAnsi="Cambria" w:hint="eastAsia"/>
-        </w:rPr>
-        <w:t xml:space="preserve"> the final outcomes. </w:t>
+        <w:t xml:space="preserve">demonstrate the final outcomes. </w:t>
       </w:r>
     </w:p>
     <w:p>
@@ -15186,21 +15028,7 @@
         <w:rPr>
           <w:rFonts w:ascii="Cambria" w:eastAsiaTheme="minorEastAsia" w:hAnsi="Cambria" w:hint="eastAsia"/>
         </w:rPr>
-        <w:t xml:space="preserve"> the use of vibe coding in </w:t>
-      </w:r>
-      <w:proofErr w:type="gramStart"/>
-      <w:r>
-        <w:rPr>
-          <w:rFonts w:ascii="Cambria" w:eastAsiaTheme="minorEastAsia" w:hAnsi="Cambria" w:hint="eastAsia"/>
-        </w:rPr>
-        <w:t>the project</w:t>
-      </w:r>
-      <w:proofErr w:type="gramEnd"/>
-      <w:r>
-        <w:rPr>
-          <w:rFonts w:ascii="Cambria" w:eastAsiaTheme="minorEastAsia" w:hAnsi="Cambria" w:hint="eastAsia"/>
-        </w:rPr>
-        <w:t xml:space="preserve"> development</w:t>
+        <w:t xml:space="preserve"> the use of vibe coding in the project development</w:t>
       </w:r>
       <w:r>
         <w:rPr>
@@ -16828,7 +16656,7 @@
 </file>
 
 <file path=word/endnotes.xml><?xml version="1.0" encoding="utf-8"?>
-<w:endnotes xmlns:wpc="http://schemas.microsoft.com/office/word/2010/wordprocessingCanvas" xmlns:cx="http://schemas.microsoft.com/office/drawing/2014/chartex" xmlns:cx1="http://schemas.microsoft.com/office/drawing/2015/9/8/chartex" xmlns:cx2="http://schemas.microsoft.com/office/drawing/2015/10/21/chartex" xmlns:cx3="http://schemas.microsoft.com/office/drawing/2016/5/9/chartex" xmlns:cx4="http://schemas.microsoft.com/office/drawing/2016/5/10/chartex" xmlns:cx5="http://schemas.microsoft.com/office/drawing/2016/5/11/chartex" xmlns:cx6="http://schemas.microsoft.com/office/drawing/2016/5/12/chartex" xmlns:cx7="http://schemas.microsoft.com/office/drawing/2016/5/13/chartex" xmlns:cx8="http://schemas.microsoft.com/office/drawing/2016/5/14/chartex" xmlns:mc="http://schemas.openxmlformats.org/markup-compatibility/2006" xmlns:aink="http://schemas.microsoft.com/office/drawing/2016/ink" xmlns:am3d="http://schemas.microsoft.com/office/drawing/2017/model3d" xmlns:o="urn:schemas-microsoft-com:office:office" xmlns:oel="http://schemas.microsoft.com/office/2019/extlst" xmlns:r="http://schemas.openxmlformats.org/officeDocument/2006/relationships" xmlns:m="http://schemas.openxmlformats.org/officeDocument/2006/math" xmlns:v="urn:schemas-microsoft-com:vml" xmlns:wp14="http://schemas.microsoft.com/office/word/2010/wordprocessingDrawing" xmlns:wp="http://schemas.openxmlformats.org/drawingml/2006/wordprocessingDrawing" xmlns:w10="urn:schemas-microsoft-com:office:word" xmlns:w="http://schemas.openxmlformats.org/wordprocessingml/2006/main" xmlns:w14="http://schemas.microsoft.com/office/word/2010/wordml" xmlns:w15="http://schemas.microsoft.com/office/word/2012/wordml" xmlns:w16cex="http://schemas.microsoft.com/office/word/2018/wordml/cex" xmlns:w16cid="http://schemas.microsoft.com/office/word/2016/wordml/cid" xmlns:w16="http://schemas.microsoft.com/office/word/2018/wordml" xmlns:w16du="http://schemas.microsoft.com/office/word/2023/wordml/word16du" xmlns:w16sdtdh="http://schemas.microsoft.com/office/word/2020/wordml/sdtdatahash" xmlns:w16sdtfl="http://schemas.microsoft.com/office/word/2024/wordml/sdtformatlock" xmlns:w16se="http://schemas.microsoft.com/office/word/2015/wordml/symex" xmlns:wpg="http://schemas.microsoft.com/office/word/2010/wordprocessingGroup" xmlns:wpi="http://schemas.microsoft.com/office/word/2010/wordprocessingInk" xmlns:wne="http://schemas.microsoft.com/office/word/2006/wordml" xmlns:wps="http://schemas.microsoft.com/office/word/2010/wordprocessingShape" mc:Ignorable="w14 w15 w16se w16cid w16 w16cex w16sdtdh w16sdtfl w16du wp14">
+<w:endnotes xmlns:wpc="http://schemas.microsoft.com/office/word/2010/wordprocessingCanvas" xmlns:cx="http://schemas.microsoft.com/office/drawing/2014/chartex" xmlns:cx1="http://schemas.microsoft.com/office/drawing/2015/9/8/chartex" xmlns:cx2="http://schemas.microsoft.com/office/drawing/2015/10/21/chartex" xmlns:cx3="http://schemas.microsoft.com/office/drawing/2016/5/9/chartex" xmlns:cx4="http://schemas.microsoft.com/office/drawing/2016/5/10/chartex" xmlns:cx5="http://schemas.microsoft.com/office/drawing/2016/5/11/chartex" xmlns:cx6="http://schemas.microsoft.com/office/drawing/2016/5/12/chartex" xmlns:cx7="http://schemas.microsoft.com/office/drawing/2016/5/13/chartex" xmlns:cx8="http://schemas.microsoft.com/office/drawing/2016/5/14/chartex" xmlns:mc="http://schemas.openxmlformats.org/markup-compatibility/2006" xmlns:m="http://schemas.openxmlformats.org/officeDocument/2006/math" xmlns:aink="http://schemas.microsoft.com/office/drawing/2016/ink" xmlns:am3d="http://schemas.microsoft.com/office/drawing/2017/model3d" xmlns:oel="http://schemas.microsoft.com/office/2019/extlst" xmlns:r="http://schemas.openxmlformats.org/officeDocument/2006/relationships" xmlns:wp14="http://schemas.microsoft.com/office/word/2010/wordprocessingDrawing" xmlns:wp="http://schemas.openxmlformats.org/drawingml/2006/wordprocessingDrawing" xmlns:wpg="http://schemas.microsoft.com/office/word/2010/wordprocessingGroup" xmlns:wpi="http://schemas.microsoft.com/office/word/2010/wordprocessingInk" xmlns:wps="http://schemas.microsoft.com/office/word/2010/wordprocessingShape" xmlns:o="urn:schemas-microsoft-com:office:office" xmlns:v="urn:schemas-microsoft-com:vml" xmlns:w10="urn:schemas-microsoft-com:office:word" xmlns:w="http://schemas.openxmlformats.org/wordprocessingml/2006/main" xmlns:w14="http://schemas.microsoft.com/office/word/2010/wordml" xmlns:w15="http://schemas.microsoft.com/office/word/2012/wordml" xmlns:w16cei="http://schemas.microsoft.com/office/word/2026/wordml/cei" xmlns:w16cex="http://schemas.microsoft.com/office/word/2018/wordml/cex" xmlns:w16cid="http://schemas.microsoft.com/office/word/2016/wordml/cid" xmlns:w16="http://schemas.microsoft.com/office/word/2018/wordml" xmlns:w16sdtdh="http://schemas.microsoft.com/office/word/2020/wordml/sdtdatahash" xmlns:w16sdtfl="http://schemas.microsoft.com/office/word/2024/wordml/sdtformatlock" xmlns:w16se="http://schemas.microsoft.com/office/word/2015/wordml/symex" xmlns:w16du="http://schemas.microsoft.com/office/word/2023/wordml/word16du" xmlns:wne="http://schemas.microsoft.com/office/word/2006/wordml" mc:Ignorable="w14 w15 w16se w16cid w16 w16cex w16sdtdh w16sdtfl w16du wp14">
   <w:endnote w:type="separator" w:id="-1">
     <w:p>
       <w:r>
@@ -16850,7 +16678,7 @@
 </file>
 
 <file path=word/footer1.xml><?xml version="1.0" encoding="utf-8"?>
-<w:ftr xmlns:wpc="http://schemas.microsoft.com/office/word/2010/wordprocessingCanvas" xmlns:cx="http://schemas.microsoft.com/office/drawing/2014/chartex" xmlns:cx1="http://schemas.microsoft.com/office/drawing/2015/9/8/chartex" xmlns:cx2="http://schemas.microsoft.com/office/drawing/2015/10/21/chartex" xmlns:cx3="http://schemas.microsoft.com/office/drawing/2016/5/9/chartex" xmlns:cx4="http://schemas.microsoft.com/office/drawing/2016/5/10/chartex" xmlns:cx5="http://schemas.microsoft.com/office/drawing/2016/5/11/chartex" xmlns:cx6="http://schemas.microsoft.com/office/drawing/2016/5/12/chartex" xmlns:cx7="http://schemas.microsoft.com/office/drawing/2016/5/13/chartex" xmlns:cx8="http://schemas.microsoft.com/office/drawing/2016/5/14/chartex" xmlns:mc="http://schemas.openxmlformats.org/markup-compatibility/2006" xmlns:aink="http://schemas.microsoft.com/office/drawing/2016/ink" xmlns:am3d="http://schemas.microsoft.com/office/drawing/2017/model3d" xmlns:o="urn:schemas-microsoft-com:office:office" xmlns:oel="http://schemas.microsoft.com/office/2019/extlst" xmlns:r="http://schemas.openxmlformats.org/officeDocument/2006/relationships" xmlns:m="http://schemas.openxmlformats.org/officeDocument/2006/math" xmlns:v="urn:schemas-microsoft-com:vml" xmlns:wp14="http://schemas.microsoft.com/office/word/2010/wordprocessingDrawing" xmlns:wp="http://schemas.openxmlformats.org/drawingml/2006/wordprocessingDrawing" xmlns:w10="urn:schemas-microsoft-com:office:word" xmlns:w="http://schemas.openxmlformats.org/wordprocessingml/2006/main" xmlns:w14="http://schemas.microsoft.com/office/word/2010/wordml" xmlns:w15="http://schemas.microsoft.com/office/word/2012/wordml" xmlns:w16cex="http://schemas.microsoft.com/office/word/2018/wordml/cex" xmlns:w16cid="http://schemas.microsoft.com/office/word/2016/wordml/cid" xmlns:w16="http://schemas.microsoft.com/office/word/2018/wordml" xmlns:w16du="http://schemas.microsoft.com/office/word/2023/wordml/word16du" xmlns:w16sdtdh="http://schemas.microsoft.com/office/word/2020/wordml/sdtdatahash" xmlns:w16sdtfl="http://schemas.microsoft.com/office/word/2024/wordml/sdtformatlock" xmlns:w16se="http://schemas.microsoft.com/office/word/2015/wordml/symex" xmlns:wpg="http://schemas.microsoft.com/office/word/2010/wordprocessingGroup" xmlns:wpi="http://schemas.microsoft.com/office/word/2010/wordprocessingInk" xmlns:wne="http://schemas.microsoft.com/office/word/2006/wordml" xmlns:wps="http://schemas.microsoft.com/office/word/2010/wordprocessingShape" mc:Ignorable="w14 w15 w16se w16cid w16 w16cex w16sdtdh w16sdtfl w16du wp14">
+<w:ftr xmlns:wpc="http://schemas.microsoft.com/office/word/2010/wordprocessingCanvas" xmlns:cx="http://schemas.microsoft.com/office/drawing/2014/chartex" xmlns:cx1="http://schemas.microsoft.com/office/drawing/2015/9/8/chartex" xmlns:cx2="http://schemas.microsoft.com/office/drawing/2015/10/21/chartex" xmlns:cx3="http://schemas.microsoft.com/office/drawing/2016/5/9/chartex" xmlns:cx4="http://schemas.microsoft.com/office/drawing/2016/5/10/chartex" xmlns:cx5="http://schemas.microsoft.com/office/drawing/2016/5/11/chartex" xmlns:cx6="http://schemas.microsoft.com/office/drawing/2016/5/12/chartex" xmlns:cx7="http://schemas.microsoft.com/office/drawing/2016/5/13/chartex" xmlns:cx8="http://schemas.microsoft.com/office/drawing/2016/5/14/chartex" xmlns:mc="http://schemas.openxmlformats.org/markup-compatibility/2006" xmlns:m="http://schemas.openxmlformats.org/officeDocument/2006/math" xmlns:aink="http://schemas.microsoft.com/office/drawing/2016/ink" xmlns:am3d="http://schemas.microsoft.com/office/drawing/2017/model3d" xmlns:oel="http://schemas.microsoft.com/office/2019/extlst" xmlns:r="http://schemas.openxmlformats.org/officeDocument/2006/relationships" xmlns:wp14="http://schemas.microsoft.com/office/word/2010/wordprocessingDrawing" xmlns:wp="http://schemas.openxmlformats.org/drawingml/2006/wordprocessingDrawing" xmlns:wpg="http://schemas.microsoft.com/office/word/2010/wordprocessingGroup" xmlns:wpi="http://schemas.microsoft.com/office/word/2010/wordprocessingInk" xmlns:wps="http://schemas.microsoft.com/office/word/2010/wordprocessingShape" xmlns:o="urn:schemas-microsoft-com:office:office" xmlns:v="urn:schemas-microsoft-com:vml" xmlns:w10="urn:schemas-microsoft-com:office:word" xmlns:w="http://schemas.openxmlformats.org/wordprocessingml/2006/main" xmlns:w14="http://schemas.microsoft.com/office/word/2010/wordml" xmlns:w15="http://schemas.microsoft.com/office/word/2012/wordml" xmlns:w16cei="http://schemas.microsoft.com/office/word/2026/wordml/cei" xmlns:w16cex="http://schemas.microsoft.com/office/word/2018/wordml/cex" xmlns:w16cid="http://schemas.microsoft.com/office/word/2016/wordml/cid" xmlns:w16="http://schemas.microsoft.com/office/word/2018/wordml" xmlns:w16sdtdh="http://schemas.microsoft.com/office/word/2020/wordml/sdtdatahash" xmlns:w16sdtfl="http://schemas.microsoft.com/office/word/2024/wordml/sdtformatlock" xmlns:w16se="http://schemas.microsoft.com/office/word/2015/wordml/symex" xmlns:w16du="http://schemas.microsoft.com/office/word/2023/wordml/word16du" xmlns:wne="http://schemas.microsoft.com/office/word/2006/wordml" mc:Ignorable="w14 w15 w16se w16cid w16 w16cex w16sdtdh w16sdtfl w16du wp14">
   <w:p>
     <w:pPr>
       <w:pStyle w:val="Footer"/>
@@ -16906,7 +16734,7 @@
 </file>
 
 <file path=word/footnotes.xml><?xml version="1.0" encoding="utf-8"?>
-<w:footnotes xmlns:wpc="http://schemas.microsoft.com/office/word/2010/wordprocessingCanvas" xmlns:cx="http://schemas.microsoft.com/office/drawing/2014/chartex" xmlns:cx1="http://schemas.microsoft.com/office/drawing/2015/9/8/chartex" xmlns:cx2="http://schemas.microsoft.com/office/drawing/2015/10/21/chartex" xmlns:cx3="http://schemas.microsoft.com/office/drawing/2016/5/9/chartex" xmlns:cx4="http://schemas.microsoft.com/office/drawing/2016/5/10/chartex" xmlns:cx5="http://schemas.microsoft.com/office/drawing/2016/5/11/chartex" xmlns:cx6="http://schemas.microsoft.com/office/drawing/2016/5/12/chartex" xmlns:cx7="http://schemas.microsoft.com/office/drawing/2016/5/13/chartex" xmlns:cx8="http://schemas.microsoft.com/office/drawing/2016/5/14/chartex" xmlns:mc="http://schemas.openxmlformats.org/markup-compatibility/2006" xmlns:aink="http://schemas.microsoft.com/office/drawing/2016/ink" xmlns:am3d="http://schemas.microsoft.com/office/drawing/2017/model3d" xmlns:o="urn:schemas-microsoft-com:office:office" xmlns:oel="http://schemas.microsoft.com/office/2019/extlst" xmlns:r="http://schemas.openxmlformats.org/officeDocument/2006/relationships" xmlns:m="http://schemas.openxmlformats.org/officeDocument/2006/math" xmlns:v="urn:schemas-microsoft-com:vml" xmlns:wp14="http://schemas.microsoft.com/office/word/2010/wordprocessingDrawing" xmlns:wp="http://schemas.openxmlformats.org/drawingml/2006/wordprocessingDrawing" xmlns:w10="urn:schemas-microsoft-com:office:word" xmlns:w="http://schemas.openxmlformats.org/wordprocessingml/2006/main" xmlns:w14="http://schemas.microsoft.com/office/word/2010/wordml" xmlns:w15="http://schemas.microsoft.com/office/word/2012/wordml" xmlns:w16cex="http://schemas.microsoft.com/office/word/2018/wordml/cex" xmlns:w16cid="http://schemas.microsoft.com/office/word/2016/wordml/cid" xmlns:w16="http://schemas.microsoft.com/office/word/2018/wordml" xmlns:w16du="http://schemas.microsoft.com/office/word/2023/wordml/word16du" xmlns:w16sdtdh="http://schemas.microsoft.com/office/word/2020/wordml/sdtdatahash" xmlns:w16sdtfl="http://schemas.microsoft.com/office/word/2024/wordml/sdtformatlock" xmlns:w16se="http://schemas.microsoft.com/office/word/2015/wordml/symex" xmlns:wpg="http://schemas.microsoft.com/office/word/2010/wordprocessingGroup" xmlns:wpi="http://schemas.microsoft.com/office/word/2010/wordprocessingInk" xmlns:wne="http://schemas.microsoft.com/office/word/2006/wordml" xmlns:wps="http://schemas.microsoft.com/office/word/2010/wordprocessingShape" mc:Ignorable="w14 w15 w16se w16cid w16 w16cex w16sdtdh w16sdtfl w16du wp14">
+<w:footnotes xmlns:wpc="http://schemas.microsoft.com/office/word/2010/wordprocessingCanvas" xmlns:cx="http://schemas.microsoft.com/office/drawing/2014/chartex" xmlns:cx1="http://schemas.microsoft.com/office/drawing/2015/9/8/chartex" xmlns:cx2="http://schemas.microsoft.com/office/drawing/2015/10/21/chartex" xmlns:cx3="http://schemas.microsoft.com/office/drawing/2016/5/9/chartex" xmlns:cx4="http://schemas.microsoft.com/office/drawing/2016/5/10/chartex" xmlns:cx5="http://schemas.microsoft.com/office/drawing/2016/5/11/chartex" xmlns:cx6="http://schemas.microsoft.com/office/drawing/2016/5/12/chartex" xmlns:cx7="http://schemas.microsoft.com/office/drawing/2016/5/13/chartex" xmlns:cx8="http://schemas.microsoft.com/office/drawing/2016/5/14/chartex" xmlns:mc="http://schemas.openxmlformats.org/markup-compatibility/2006" xmlns:m="http://schemas.openxmlformats.org/officeDocument/2006/math" xmlns:aink="http://schemas.microsoft.com/office/drawing/2016/ink" xmlns:am3d="http://schemas.microsoft.com/office/drawing/2017/model3d" xmlns:oel="http://schemas.microsoft.com/office/2019/extlst" xmlns:r="http://schemas.openxmlformats.org/officeDocument/2006/relationships" xmlns:wp14="http://schemas.microsoft.com/office/word/2010/wordprocessingDrawing" xmlns:wp="http://schemas.openxmlformats.org/drawingml/2006/wordprocessingDrawing" xmlns:wpg="http://schemas.microsoft.com/office/word/2010/wordprocessingGroup" xmlns:wpi="http://schemas.microsoft.com/office/word/2010/wordprocessingInk" xmlns:wps="http://schemas.microsoft.com/office/word/2010/wordprocessingShape" xmlns:o="urn:schemas-microsoft-com:office:office" xmlns:v="urn:schemas-microsoft-com:vml" xmlns:w10="urn:schemas-microsoft-com:office:word" xmlns:w="http://schemas.openxmlformats.org/wordprocessingml/2006/main" xmlns:w14="http://schemas.microsoft.com/office/word/2010/wordml" xmlns:w15="http://schemas.microsoft.com/office/word/2012/wordml" xmlns:w16cei="http://schemas.microsoft.com/office/word/2026/wordml/cei" xmlns:w16cex="http://schemas.microsoft.com/office/word/2018/wordml/cex" xmlns:w16cid="http://schemas.microsoft.com/office/word/2016/wordml/cid" xmlns:w16="http://schemas.microsoft.com/office/word/2018/wordml" xmlns:w16sdtdh="http://schemas.microsoft.com/office/word/2020/wordml/sdtdatahash" xmlns:w16sdtfl="http://schemas.microsoft.com/office/word/2024/wordml/sdtformatlock" xmlns:w16se="http://schemas.microsoft.com/office/word/2015/wordml/symex" xmlns:w16du="http://schemas.microsoft.com/office/word/2023/wordml/word16du" xmlns:wne="http://schemas.microsoft.com/office/word/2006/wordml" mc:Ignorable="w14 w15 w16se w16cid w16 w16cex w16sdtdh w16sdtfl w16du wp14">
   <w:footnote w:type="separator" w:id="-1">
     <w:p>
       <w:r>
@@ -16928,7 +16756,7 @@
 </file>
 
 <file path=word/header1.xml><?xml version="1.0" encoding="utf-8"?>
-<w:hdr xmlns:wpc="http://schemas.microsoft.com/office/word/2010/wordprocessingCanvas" xmlns:cx="http://schemas.microsoft.com/office/drawing/2014/chartex" xmlns:cx1="http://schemas.microsoft.com/office/drawing/2015/9/8/chartex" xmlns:cx2="http://schemas.microsoft.com/office/drawing/2015/10/21/chartex" xmlns:cx3="http://schemas.microsoft.com/office/drawing/2016/5/9/chartex" xmlns:cx4="http://schemas.microsoft.com/office/drawing/2016/5/10/chartex" xmlns:cx5="http://schemas.microsoft.com/office/drawing/2016/5/11/chartex" xmlns:cx6="http://schemas.microsoft.com/office/drawing/2016/5/12/chartex" xmlns:cx7="http://schemas.microsoft.com/office/drawing/2016/5/13/chartex" xmlns:cx8="http://schemas.microsoft.com/office/drawing/2016/5/14/chartex" xmlns:mc="http://schemas.openxmlformats.org/markup-compatibility/2006" xmlns:aink="http://schemas.microsoft.com/office/drawing/2016/ink" xmlns:am3d="http://schemas.microsoft.com/office/drawing/2017/model3d" xmlns:o="urn:schemas-microsoft-com:office:office" xmlns:oel="http://schemas.microsoft.com/office/2019/extlst" xmlns:r="http://schemas.openxmlformats.org/officeDocument/2006/relationships" xmlns:m="http://schemas.openxmlformats.org/officeDocument/2006/math" xmlns:v="urn:schemas-microsoft-com:vml" xmlns:wp14="http://schemas.microsoft.com/office/word/2010/wordprocessingDrawing" xmlns:wp="http://schemas.openxmlformats.org/drawingml/2006/wordprocessingDrawing" xmlns:w10="urn:schemas-microsoft-com:office:word" xmlns:w="http://schemas.openxmlformats.org/wordprocessingml/2006/main" xmlns:w14="http://schemas.microsoft.com/office/word/2010/wordml" xmlns:w15="http://schemas.microsoft.com/office/word/2012/wordml" xmlns:w16cex="http://schemas.microsoft.com/office/word/2018/wordml/cex" xmlns:w16cid="http://schemas.microsoft.com/office/word/2016/wordml/cid" xmlns:w16="http://schemas.microsoft.com/office/word/2018/wordml" xmlns:w16du="http://schemas.microsoft.com/office/word/2023/wordml/word16du" xmlns:w16sdtdh="http://schemas.microsoft.com/office/word/2020/wordml/sdtdatahash" xmlns:w16sdtfl="http://schemas.microsoft.com/office/word/2024/wordml/sdtformatlock" xmlns:w16se="http://schemas.microsoft.com/office/word/2015/wordml/symex" xmlns:wpg="http://schemas.microsoft.com/office/word/2010/wordprocessingGroup" xmlns:wpi="http://schemas.microsoft.com/office/word/2010/wordprocessingInk" xmlns:wne="http://schemas.microsoft.com/office/word/2006/wordml" xmlns:wps="http://schemas.microsoft.com/office/word/2010/wordprocessingShape" mc:Ignorable="w14 w15 w16se w16cid w16 w16cex w16sdtdh w16sdtfl w16du wp14">
+<w:hdr xmlns:wpc="http://schemas.microsoft.com/office/word/2010/wordprocessingCanvas" xmlns:cx="http://schemas.microsoft.com/office/drawing/2014/chartex" xmlns:cx1="http://schemas.microsoft.com/office/drawing/2015/9/8/chartex" xmlns:cx2="http://schemas.microsoft.com/office/drawing/2015/10/21/chartex" xmlns:cx3="http://schemas.microsoft.com/office/drawing/2016/5/9/chartex" xmlns:cx4="http://schemas.microsoft.com/office/drawing/2016/5/10/chartex" xmlns:cx5="http://schemas.microsoft.com/office/drawing/2016/5/11/chartex" xmlns:cx6="http://schemas.microsoft.com/office/drawing/2016/5/12/chartex" xmlns:cx7="http://schemas.microsoft.com/office/drawing/2016/5/13/chartex" xmlns:cx8="http://schemas.microsoft.com/office/drawing/2016/5/14/chartex" xmlns:mc="http://schemas.openxmlformats.org/markup-compatibility/2006" xmlns:m="http://schemas.openxmlformats.org/officeDocument/2006/math" xmlns:aink="http://schemas.microsoft.com/office/drawing/2016/ink" xmlns:am3d="http://schemas.microsoft.com/office/drawing/2017/model3d" xmlns:oel="http://schemas.microsoft.com/office/2019/extlst" xmlns:r="http://schemas.openxmlformats.org/officeDocument/2006/relationships" xmlns:wp14="http://schemas.microsoft.com/office/word/2010/wordprocessingDrawing" xmlns:wp="http://schemas.openxmlformats.org/drawingml/2006/wordprocessingDrawing" xmlns:wpg="http://schemas.microsoft.com/office/word/2010/wordprocessingGroup" xmlns:wpi="http://schemas.microsoft.com/office/word/2010/wordprocessingInk" xmlns:wps="http://schemas.microsoft.com/office/word/2010/wordprocessingShape" xmlns:o="urn:schemas-microsoft-com:office:office" xmlns:v="urn:schemas-microsoft-com:vml" xmlns:w10="urn:schemas-microsoft-com:office:word" xmlns:w="http://schemas.openxmlformats.org/wordprocessingml/2006/main" xmlns:w14="http://schemas.microsoft.com/office/word/2010/wordml" xmlns:w15="http://schemas.microsoft.com/office/word/2012/wordml" xmlns:w16cei="http://schemas.microsoft.com/office/word/2026/wordml/cei" xmlns:w16cex="http://schemas.microsoft.com/office/word/2018/wordml/cex" xmlns:w16cid="http://schemas.microsoft.com/office/word/2016/wordml/cid" xmlns:w16="http://schemas.microsoft.com/office/word/2018/wordml" xmlns:w16sdtdh="http://schemas.microsoft.com/office/word/2020/wordml/sdtdatahash" xmlns:w16sdtfl="http://schemas.microsoft.com/office/word/2024/wordml/sdtformatlock" xmlns:w16se="http://schemas.microsoft.com/office/word/2015/wordml/symex" xmlns:w16du="http://schemas.microsoft.com/office/word/2023/wordml/word16du" xmlns:wne="http://schemas.microsoft.com/office/word/2006/wordml" mc:Ignorable="w14 w15 w16se w16cid w16 w16cex w16sdtdh w16sdtfl w16du wp14">
   <w:p>
     <w:pPr>
       <w:pStyle w:val="Header"/>
@@ -16942,7 +16770,7 @@
 </file>
 
 <file path=word/numbering.xml><?xml version="1.0" encoding="utf-8"?>
-<w:numbering xmlns:wpc="http://schemas.microsoft.com/office/word/2010/wordprocessingCanvas" xmlns:cx="http://schemas.microsoft.com/office/drawing/2014/chartex" xmlns:cx1="http://schemas.microsoft.com/office/drawing/2015/9/8/chartex" xmlns:cx2="http://schemas.microsoft.com/office/drawing/2015/10/21/chartex" xmlns:cx3="http://schemas.microsoft.com/office/drawing/2016/5/9/chartex" xmlns:cx4="http://schemas.microsoft.com/office/drawing/2016/5/10/chartex" xmlns:cx5="http://schemas.microsoft.com/office/drawing/2016/5/11/chartex" xmlns:cx6="http://schemas.microsoft.com/office/drawing/2016/5/12/chartex" xmlns:cx7="http://schemas.microsoft.com/office/drawing/2016/5/13/chartex" xmlns:cx8="http://schemas.microsoft.com/office/drawing/2016/5/14/chartex" xmlns:mc="http://schemas.openxmlformats.org/markup-compatibility/2006" xmlns:aink="http://schemas.microsoft.com/office/drawing/2016/ink" xmlns:am3d="http://schemas.microsoft.com/office/drawing/2017/model3d" xmlns:o="urn:schemas-microsoft-com:office:office" xmlns:oel="http://schemas.microsoft.com/office/2019/extlst" xmlns:r="http://schemas.openxmlformats.org/officeDocument/2006/relationships" xmlns:m="http://schemas.openxmlformats.org/officeDocument/2006/math" xmlns:v="urn:schemas-microsoft-com:vml" xmlns:wp14="http://schemas.microsoft.com/office/word/2010/wordprocessingDrawing" xmlns:wp="http://schemas.openxmlformats.org/drawingml/2006/wordprocessingDrawing" xmlns:w10="urn:schemas-microsoft-com:office:word" xmlns:w="http://schemas.openxmlformats.org/wordprocessingml/2006/main" xmlns:w14="http://schemas.microsoft.com/office/word/2010/wordml" xmlns:w15="http://schemas.microsoft.com/office/word/2012/wordml" xmlns:w16cex="http://schemas.microsoft.com/office/word/2018/wordml/cex" xmlns:w16cid="http://schemas.microsoft.com/office/word/2016/wordml/cid" xmlns:w16="http://schemas.microsoft.com/office/word/2018/wordml" xmlns:w16du="http://schemas.microsoft.com/office/word/2023/wordml/word16du" xmlns:w16sdtdh="http://schemas.microsoft.com/office/word/2020/wordml/sdtdatahash" xmlns:w16sdtfl="http://schemas.microsoft.com/office/word/2024/wordml/sdtformatlock" xmlns:w16se="http://schemas.microsoft.com/office/word/2015/wordml/symex" xmlns:wpg="http://schemas.microsoft.com/office/word/2010/wordprocessingGroup" xmlns:wpi="http://schemas.microsoft.com/office/word/2010/wordprocessingInk" xmlns:wne="http://schemas.microsoft.com/office/word/2006/wordml" xmlns:wps="http://schemas.microsoft.com/office/word/2010/wordprocessingShape" mc:Ignorable="w14 w15 w16se w16cid w16 w16cex w16sdtdh w16sdtfl w16du wp14">
+<w:numbering xmlns:wpc="http://schemas.microsoft.com/office/word/2010/wordprocessingCanvas" xmlns:cx="http://schemas.microsoft.com/office/drawing/2014/chartex" xmlns:cx1="http://schemas.microsoft.com/office/drawing/2015/9/8/chartex" xmlns:cx2="http://schemas.microsoft.com/office/drawing/2015/10/21/chartex" xmlns:cx3="http://schemas.microsoft.com/office/drawing/2016/5/9/chartex" xmlns:cx4="http://schemas.microsoft.com/office/drawing/2016/5/10/chartex" xmlns:cx5="http://schemas.microsoft.com/office/drawing/2016/5/11/chartex" xmlns:cx6="http://schemas.microsoft.com/office/drawing/2016/5/12/chartex" xmlns:cx7="http://schemas.microsoft.com/office/drawing/2016/5/13/chartex" xmlns:cx8="http://schemas.microsoft.com/office/drawing/2016/5/14/chartex" xmlns:mc="http://schemas.openxmlformats.org/markup-compatibility/2006" xmlns:m="http://schemas.openxmlformats.org/officeDocument/2006/math" xmlns:aink="http://schemas.microsoft.com/office/drawing/2016/ink" xmlns:am3d="http://schemas.microsoft.com/office/drawing/2017/model3d" xmlns:oel="http://schemas.microsoft.com/office/2019/extlst" xmlns:r="http://schemas.openxmlformats.org/officeDocument/2006/relationships" xmlns:wp14="http://schemas.microsoft.com/office/word/2010/wordprocessingDrawing" xmlns:wp="http://schemas.openxmlformats.org/drawingml/2006/wordprocessingDrawing" xmlns:wpg="http://schemas.microsoft.com/office/word/2010/wordprocessingGroup" xmlns:wpi="http://schemas.microsoft.com/office/word/2010/wordprocessingInk" xmlns:wps="http://schemas.microsoft.com/office/word/2010/wordprocessingShape" xmlns:o="urn:schemas-microsoft-com:office:office" xmlns:v="urn:schemas-microsoft-com:vml" xmlns:w10="urn:schemas-microsoft-com:office:word" xmlns:w="http://schemas.openxmlformats.org/wordprocessingml/2006/main" xmlns:w14="http://schemas.microsoft.com/office/word/2010/wordml" xmlns:w15="http://schemas.microsoft.com/office/word/2012/wordml" xmlns:w16cei="http://schemas.microsoft.com/office/word/2026/wordml/cei" xmlns:w16cex="http://schemas.microsoft.com/office/word/2018/wordml/cex" xmlns:w16cid="http://schemas.microsoft.com/office/word/2016/wordml/cid" xmlns:w16="http://schemas.microsoft.com/office/word/2018/wordml" xmlns:w16sdtdh="http://schemas.microsoft.com/office/word/2020/wordml/sdtdatahash" xmlns:w16sdtfl="http://schemas.microsoft.com/office/word/2024/wordml/sdtformatlock" xmlns:w16se="http://schemas.microsoft.com/office/word/2015/wordml/symex" xmlns:w16du="http://schemas.microsoft.com/office/word/2023/wordml/word16du" xmlns:wne="http://schemas.microsoft.com/office/word/2006/wordml" mc:Ignorable="w14 w15 w16se w16cid w16 w16cex w16sdtdh w16sdtfl w16du wp14">
   <w:abstractNum w:abstractNumId="0" w15:restartNumberingAfterBreak="0">
     <w:nsid w:val="067C62FE"/>
     <w:multiLevelType w:val="hybridMultilevel"/>
@@ -21236,7 +21064,7 @@
 </file>
 
 <file path=word/styles.xml><?xml version="1.0" encoding="utf-8"?>
-<w:styles xmlns:mc="http://schemas.openxmlformats.org/markup-compatibility/2006" xmlns:r="http://schemas.openxmlformats.org/officeDocument/2006/relationships" xmlns:w="http://schemas.openxmlformats.org/wordprocessingml/2006/main" xmlns:w14="http://schemas.microsoft.com/office/word/2010/wordml" xmlns:w15="http://schemas.microsoft.com/office/word/2012/wordml" xmlns:w16cex="http://schemas.microsoft.com/office/word/2018/wordml/cex" xmlns:w16cid="http://schemas.microsoft.com/office/word/2016/wordml/cid" xmlns:w16="http://schemas.microsoft.com/office/word/2018/wordml" xmlns:w16du="http://schemas.microsoft.com/office/word/2023/wordml/word16du" xmlns:w16sdtdh="http://schemas.microsoft.com/office/word/2020/wordml/sdtdatahash" xmlns:w16sdtfl="http://schemas.microsoft.com/office/word/2024/wordml/sdtformatlock" xmlns:w16se="http://schemas.microsoft.com/office/word/2015/wordml/symex" mc:Ignorable="w14 w15 w16se w16cid w16 w16cex w16sdtdh w16sdtfl w16du">
+<w:styles xmlns:mc="http://schemas.openxmlformats.org/markup-compatibility/2006" xmlns:r="http://schemas.openxmlformats.org/officeDocument/2006/relationships" xmlns:w="http://schemas.openxmlformats.org/wordprocessingml/2006/main" xmlns:w14="http://schemas.microsoft.com/office/word/2010/wordml" xmlns:w15="http://schemas.microsoft.com/office/word/2012/wordml" xmlns:w16cex="http://schemas.microsoft.com/office/word/2018/wordml/cex" xmlns:w16cid="http://schemas.microsoft.com/office/word/2016/wordml/cid" xmlns:w16="http://schemas.microsoft.com/office/word/2018/wordml" xmlns:w16sdtdh="http://schemas.microsoft.com/office/word/2020/wordml/sdtdatahash" xmlns:w16sdtfl="http://schemas.microsoft.com/office/word/2024/wordml/sdtformatlock" xmlns:w16se="http://schemas.microsoft.com/office/word/2015/wordml/symex" xmlns:w16du="http://schemas.microsoft.com/office/word/2023/wordml/word16du" mc:Ignorable="w14 w15 w16se w16cid w16 w16cex w16sdtdh w16sdtfl w16du">
   <w:docDefaults>
     <w:rPrDefault>
       <w:rPr>

</xml_diff>